<commit_message>
Phase 88: T16-T23 held to the table audit, and the ablation rows reconciled
T16-T23 were written by Phases 70-78. They are now held to the same
definition of a finished table as T08-T15, and the four that failed it
were regenerated through their owning scripts' table stages:
T20/T21/T22 (places overrides unrecorded, blank n/a cells) and T23
(D:/ source paths). A content-digest snapshot of all 696 output data
files before and after shows no intermediate file changed.

Phase 87's portable_path fix had covered only the missing-file branch
of source_fingerprint; the gate caught it on T23. Both branches are now
pinned by tests/test_table_engine.py.

Gate T88.7: every T17/T18/T19 row re-derives at 1e-9 from each EXP-F1
arm's own run directory, the EXP-A1/A2 runs and EXP-F2's A9/A10 files.

Co-Authored-By: Claude Opus 5 <noreply@anthropic.com>
</commit_message>
<xml_diff>
--- a/outputs/08_circor_external_validation/T22_auscultation_location_analysis.docx
+++ b/outputs/08_circor_external_validation/T22_auscultation_location_analysis.docx
@@ -558,6 +558,7 @@
               <w:rPr>
                 <w:sz w:val="18"/>
               </w:rPr>
+              <w:t>n/a</w:t>
             </w:r>
           </w:p>
         </w:tc>
@@ -806,6 +807,7 @@
               <w:rPr>
                 <w:sz w:val="18"/>
               </w:rPr>
+              <w:t>n/a</w:t>
             </w:r>
           </w:p>
         </w:tc>
@@ -1054,6 +1056,7 @@
               <w:rPr>
                 <w:sz w:val="18"/>
               </w:rPr>
+              <w:t>n/a</w:t>
             </w:r>
           </w:p>
         </w:tc>
@@ -1551,6 +1554,7 @@
               <w:rPr>
                 <w:sz w:val="18"/>
               </w:rPr>
+              <w:t>n/a</w:t>
             </w:r>
           </w:p>
         </w:tc>
@@ -1799,6 +1803,7 @@
               <w:rPr>
                 <w:sz w:val="18"/>
               </w:rPr>
+              <w:t>n/a</w:t>
             </w:r>
           </w:p>
         </w:tc>
@@ -2047,6 +2052,7 @@
               <w:rPr>
                 <w:sz w:val="18"/>
               </w:rPr>
+              <w:t>n/a</w:t>
             </w:r>
           </w:p>
         </w:tc>
@@ -2295,6 +2301,7 @@
               <w:rPr>
                 <w:sz w:val="18"/>
               </w:rPr>
+              <w:t>n/a</w:t>
             </w:r>
           </w:p>
         </w:tc>
@@ -2792,6 +2799,7 @@
               <w:rPr>
                 <w:sz w:val="18"/>
               </w:rPr>
+              <w:t>n/a</w:t>
             </w:r>
           </w:p>
         </w:tc>
@@ -3040,6 +3048,7 @@
               <w:rPr>
                 <w:sz w:val="18"/>
               </w:rPr>
+              <w:t>n/a</w:t>
             </w:r>
           </w:p>
         </w:tc>
@@ -3288,6 +3297,7 @@
               <w:rPr>
                 <w:sz w:val="18"/>
               </w:rPr>
+              <w:t>n/a</w:t>
             </w:r>
           </w:p>
         </w:tc>
@@ -3536,6 +3546,7 @@
               <w:rPr>
                 <w:sz w:val="18"/>
               </w:rPr>
+              <w:t>n/a</w:t>
             </w:r>
           </w:p>
         </w:tc>
@@ -4033,6 +4044,7 @@
               <w:rPr>
                 <w:sz w:val="18"/>
               </w:rPr>
+              <w:t>n/a</w:t>
             </w:r>
           </w:p>
         </w:tc>
@@ -4281,6 +4293,7 @@
               <w:rPr>
                 <w:sz w:val="18"/>
               </w:rPr>
+              <w:t>n/a</w:t>
             </w:r>
           </w:p>
         </w:tc>
@@ -4529,6 +4542,7 @@
               <w:rPr>
                 <w:sz w:val="18"/>
               </w:rPr>
+              <w:t>n/a</w:t>
             </w:r>
           </w:p>
         </w:tc>
@@ -4777,6 +4791,7 @@
               <w:rPr>
                 <w:sz w:val="18"/>
               </w:rPr>
+              <w:t>n/a</w:t>
             </w:r>
           </w:p>
         </w:tc>
@@ -5274,6 +5289,7 @@
               <w:rPr>
                 <w:sz w:val="18"/>
               </w:rPr>
+              <w:t>n/a</w:t>
             </w:r>
           </w:p>
         </w:tc>
@@ -5522,6 +5538,7 @@
               <w:rPr>
                 <w:sz w:val="18"/>
               </w:rPr>
+              <w:t>n/a</w:t>
             </w:r>
           </w:p>
         </w:tc>
@@ -5770,6 +5787,7 @@
               <w:rPr>
                 <w:sz w:val="18"/>
               </w:rPr>
+              <w:t>n/a</w:t>
             </w:r>
           </w:p>
         </w:tc>
@@ -6018,6 +6036,7 @@
               <w:rPr>
                 <w:sz w:val="18"/>
               </w:rPr>
+              <w:t>n/a</w:t>
             </w:r>
           </w:p>
         </w:tc>
@@ -6515,6 +6534,7 @@
               <w:rPr>
                 <w:sz w:val="18"/>
               </w:rPr>
+              <w:t>n/a</w:t>
             </w:r>
           </w:p>
         </w:tc>
@@ -6763,6 +6783,7 @@
               <w:rPr>
                 <w:sz w:val="18"/>
               </w:rPr>
+              <w:t>n/a</w:t>
             </w:r>
           </w:p>
         </w:tc>
@@ -7011,6 +7032,7 @@
               <w:rPr>
                 <w:sz w:val="18"/>
               </w:rPr>
+              <w:t>n/a</w:t>
             </w:r>
           </w:p>
         </w:tc>
@@ -7259,6 +7281,7 @@
               <w:rPr>
                 <w:sz w:val="18"/>
               </w:rPr>
+              <w:t>n/a</w:t>
             </w:r>
           </w:p>
         </w:tc>
@@ -7756,6 +7779,7 @@
               <w:rPr>
                 <w:sz w:val="18"/>
               </w:rPr>
+              <w:t>n/a</w:t>
             </w:r>
           </w:p>
         </w:tc>
@@ -8004,6 +8028,7 @@
               <w:rPr>
                 <w:sz w:val="18"/>
               </w:rPr>
+              <w:t>n/a</w:t>
             </w:r>
           </w:p>
         </w:tc>
@@ -8252,6 +8277,7 @@
               <w:rPr>
                 <w:sz w:val="18"/>
               </w:rPr>
+              <w:t>n/a</w:t>
             </w:r>
           </w:p>
         </w:tc>
@@ -8500,6 +8526,7 @@
               <w:rPr>
                 <w:sz w:val="18"/>
               </w:rPr>
+              <w:t>n/a</w:t>
             </w:r>
           </w:p>
         </w:tc>
@@ -8997,6 +9024,7 @@
               <w:rPr>
                 <w:sz w:val="18"/>
               </w:rPr>
+              <w:t>n/a</w:t>
             </w:r>
           </w:p>
         </w:tc>
@@ -9245,6 +9273,7 @@
               <w:rPr>
                 <w:sz w:val="18"/>
               </w:rPr>
+              <w:t>n/a</w:t>
             </w:r>
           </w:p>
         </w:tc>
@@ -9493,6 +9522,7 @@
               <w:rPr>
                 <w:sz w:val="18"/>
               </w:rPr>
+              <w:t>n/a</w:t>
             </w:r>
           </w:p>
         </w:tc>
@@ -9741,6 +9771,7 @@
               <w:rPr>
                 <w:sz w:val="18"/>
               </w:rPr>
+              <w:t>n/a</w:t>
             </w:r>
           </w:p>
         </w:tc>
@@ -10238,6 +10269,7 @@
               <w:rPr>
                 <w:sz w:val="18"/>
               </w:rPr>
+              <w:t>n/a</w:t>
             </w:r>
           </w:p>
         </w:tc>
@@ -10486,6 +10518,7 @@
               <w:rPr>
                 <w:sz w:val="18"/>
               </w:rPr>
+              <w:t>n/a</w:t>
             </w:r>
           </w:p>
         </w:tc>
@@ -10734,6 +10767,7 @@
               <w:rPr>
                 <w:sz w:val="18"/>
               </w:rPr>
+              <w:t>n/a</w:t>
             </w:r>
           </w:p>
         </w:tc>
@@ -10982,6 +11016,7 @@
               <w:rPr>
                 <w:sz w:val="18"/>
               </w:rPr>
+              <w:t>n/a</w:t>
             </w:r>
           </w:p>
         </w:tc>
@@ -11479,6 +11514,7 @@
               <w:rPr>
                 <w:sz w:val="18"/>
               </w:rPr>
+              <w:t>n/a</w:t>
             </w:r>
           </w:p>
         </w:tc>
@@ -11727,6 +11763,7 @@
               <w:rPr>
                 <w:sz w:val="18"/>
               </w:rPr>
+              <w:t>n/a</w:t>
             </w:r>
           </w:p>
         </w:tc>
@@ -11975,6 +12012,7 @@
               <w:rPr>
                 <w:sz w:val="18"/>
               </w:rPr>
+              <w:t>n/a</w:t>
             </w:r>
           </w:p>
         </w:tc>
@@ -12223,6 +12261,7 @@
               <w:rPr>
                 <w:sz w:val="18"/>
               </w:rPr>
+              <w:t>n/a</w:t>
             </w:r>
           </w:p>
         </w:tc>
@@ -12720,6 +12759,7 @@
               <w:rPr>
                 <w:sz w:val="18"/>
               </w:rPr>
+              <w:t>n/a</w:t>
             </w:r>
           </w:p>
         </w:tc>
@@ -12968,6 +13008,7 @@
               <w:rPr>
                 <w:sz w:val="18"/>
               </w:rPr>
+              <w:t>n/a</w:t>
             </w:r>
           </w:p>
         </w:tc>
@@ -13216,6 +13257,7 @@
               <w:rPr>
                 <w:sz w:val="18"/>
               </w:rPr>
+              <w:t>n/a</w:t>
             </w:r>
           </w:p>
         </w:tc>
@@ -13464,6 +13506,7 @@
               <w:rPr>
                 <w:sz w:val="18"/>
               </w:rPr>
+              <w:t>n/a</w:t>
             </w:r>
           </w:p>
         </w:tc>
@@ -13961,6 +14004,7 @@
               <w:rPr>
                 <w:sz w:val="18"/>
               </w:rPr>
+              <w:t>n/a</w:t>
             </w:r>
           </w:p>
         </w:tc>
@@ -14209,6 +14253,7 @@
               <w:rPr>
                 <w:sz w:val="18"/>
               </w:rPr>
+              <w:t>n/a</w:t>
             </w:r>
           </w:p>
         </w:tc>
@@ -14457,6 +14502,7 @@
               <w:rPr>
                 <w:sz w:val="18"/>
               </w:rPr>
+              <w:t>n/a</w:t>
             </w:r>
           </w:p>
         </w:tc>
@@ -14705,6 +14751,7 @@
               <w:rPr>
                 <w:sz w:val="18"/>
               </w:rPr>
+              <w:t>n/a</w:t>
             </w:r>
           </w:p>
         </w:tc>
@@ -15202,6 +15249,7 @@
               <w:rPr>
                 <w:sz w:val="18"/>
               </w:rPr>
+              <w:t>n/a</w:t>
             </w:r>
           </w:p>
         </w:tc>
@@ -15450,6 +15498,7 @@
               <w:rPr>
                 <w:sz w:val="18"/>
               </w:rPr>
+              <w:t>n/a</w:t>
             </w:r>
           </w:p>
         </w:tc>
@@ -15698,6 +15747,7 @@
               <w:rPr>
                 <w:sz w:val="18"/>
               </w:rPr>
+              <w:t>n/a</w:t>
             </w:r>
           </w:p>
         </w:tc>
@@ -15946,6 +15996,7 @@
               <w:rPr>
                 <w:sz w:val="18"/>
               </w:rPr>
+              <w:t>n/a</w:t>
             </w:r>
           </w:p>
         </w:tc>
@@ -16443,6 +16494,7 @@
               <w:rPr>
                 <w:sz w:val="18"/>
               </w:rPr>
+              <w:t>n/a</w:t>
             </w:r>
           </w:p>
         </w:tc>
@@ -16691,6 +16743,7 @@
               <w:rPr>
                 <w:sz w:val="18"/>
               </w:rPr>
+              <w:t>n/a</w:t>
             </w:r>
           </w:p>
         </w:tc>
@@ -16939,6 +16992,7 @@
               <w:rPr>
                 <w:sz w:val="18"/>
               </w:rPr>
+              <w:t>n/a</w:t>
             </w:r>
           </w:p>
         </w:tc>
@@ -17187,6 +17241,7 @@
               <w:rPr>
                 <w:sz w:val="18"/>
               </w:rPr>
+              <w:t>n/a</w:t>
             </w:r>
           </w:p>
         </w:tc>
@@ -17684,6 +17739,7 @@
               <w:rPr>
                 <w:sz w:val="18"/>
               </w:rPr>
+              <w:t>n/a</w:t>
             </w:r>
           </w:p>
         </w:tc>
@@ -17932,6 +17988,7 @@
               <w:rPr>
                 <w:sz w:val="18"/>
               </w:rPr>
+              <w:t>n/a</w:t>
             </w:r>
           </w:p>
         </w:tc>
@@ -18180,6 +18237,7 @@
               <w:rPr>
                 <w:sz w:val="18"/>
               </w:rPr>
+              <w:t>n/a</w:t>
             </w:r>
           </w:p>
         </w:tc>
@@ -18428,6 +18486,7 @@
               <w:rPr>
                 <w:sz w:val="18"/>
               </w:rPr>
+              <w:t>n/a</w:t>
             </w:r>
           </w:p>
         </w:tc>
@@ -18925,6 +18984,7 @@
               <w:rPr>
                 <w:sz w:val="18"/>
               </w:rPr>
+              <w:t>n/a</w:t>
             </w:r>
           </w:p>
         </w:tc>
@@ -18999,7 +19059,7 @@
           <w:i/>
           <w:sz w:val="14"/>
         </w:rPr>
-        <w:t>Generated by PV-MEPCG / PulseVision at 2026-08-31T07:58:18.122096+00:00</w:t>
+        <w:t>Generated by PV-MEPCG / PulseVision at 2026-09-10T17:03:49.506551+00:00</w:t>
       </w:r>
     </w:p>
     <w:sectPr>

</xml_diff>